<commit_message>
docs: checkpoint reports before portfolio cleanup
</commit_message>
<xml_diff>
--- a/reports/documents/Bang_Dong_Gop_Du_An.docx
+++ b/reports/documents/Bang_Dong_Gop_Du_An.docx
@@ -2,6 +2,67 @@
 <file path=word/document.xml><?xml version="1.0" encoding="utf-8"?>
 <w:document xmlns:wpc="http://schemas.microsoft.com/office/word/2010/wordprocessingCanvas" xmlns:mo="http://schemas.microsoft.com/office/mac/office/2008/main" xmlns:mc="http://schemas.openxmlformats.org/markup-compatibility/2006" xmlns:mv="urn:schemas-microsoft-com:mac:vml" xmlns:o="urn:schemas-microsoft-com:office:office" xmlns:r="http://schemas.openxmlformats.org/officeDocument/2006/relationships" xmlns:m="http://schemas.openxmlformats.org/officeDocument/2006/math" xmlns:v="urn:schemas-microsoft-com:vml" xmlns:wp14="http://schemas.microsoft.com/office/word/2010/wordprocessingDrawing" xmlns:wp="http://schemas.openxmlformats.org/drawingml/2006/wordprocessingDrawing" xmlns:w10="urn:schemas-microsoft-com:office:word" xmlns:w="http://schemas.openxmlformats.org/wordprocessingml/2006/main" xmlns:w14="http://schemas.microsoft.com/office/word/2010/wordml" xmlns:wpg="http://schemas.microsoft.com/office/word/2010/wordprocessingGroup" xmlns:wpi="http://schemas.microsoft.com/office/word/2010/wordprocessingInk" xmlns:wne="http://schemas.microsoft.com/office/word/2006/wordml" xmlns:wps="http://schemas.microsoft.com/office/word/2010/wordprocessingShape" mc:Ignorable="w14 wp14">
   <w:body>
+    <w:p>
+      <w:r>
+        <w:rPr>
+          <w:rFonts w:ascii="Times New Roman" w:hAnsi="Times New Roman" w:eastAsia="Times New Roman"/>
+          <w:b/>
+          <w:color w:val="1A365D"/>
+          <w:sz w:val="24"/>
+        </w:rPr>
+        <w:t>Thông tin mã nguồn (GitHub)</w:t>
+      </w:r>
+    </w:p>
+    <w:p>
+      <w:r>
+        <w:rPr>
+          <w:rFonts w:ascii="Times New Roman" w:hAnsi="Times New Roman" w:eastAsia="Times New Roman"/>
+          <w:b/>
+          <w:color w:val="1A365D"/>
+          <w:sz w:val="22"/>
+        </w:rPr>
+        <w:t>Repository: https://github.com/Therockycloud/PDL302m_project</w:t>
+      </w:r>
+    </w:p>
+    <w:p>
+      <w:r>
+        <w:rPr>
+          <w:rFonts w:ascii="Times New Roman" w:hAnsi="Times New Roman" w:eastAsia="Times New Roman"/>
+          <w:b w:val="0"/>
+          <w:sz w:val="22"/>
+        </w:rPr>
+        <w:t>Clone: git clone https://github.com/Therockycloud/PDL302m_project.git</w:t>
+      </w:r>
+    </w:p>
+    <w:p>
+      <w:r>
+        <w:rPr>
+          <w:rFonts w:ascii="Times New Roman" w:hAnsi="Times New Roman" w:eastAsia="Times New Roman"/>
+          <w:b w:val="0"/>
+          <w:sz w:val="22"/>
+        </w:rPr>
+        <w:t>Nhánh chính: main</w:t>
+      </w:r>
+    </w:p>
+    <w:p>
+      <w:r>
+        <w:rPr>
+          <w:rFonts w:ascii="Times New Roman" w:hAnsi="Times New Roman" w:eastAsia="Times New Roman"/>
+          <w:b w:val="0"/>
+          <w:sz w:val="22"/>
+        </w:rPr>
+        <w:t>README: https://github.com/Therockycloud/PDL302m_project/blob/main/README.md</w:t>
+      </w:r>
+    </w:p>
+    <w:p>
+      <w:r>
+        <w:rPr>
+          <w:rFonts w:ascii="Times New Roman" w:hAnsi="Times New Roman" w:eastAsia="Times New Roman"/>
+          <w:b w:val="0"/>
+          <w:sz w:val="22"/>
+        </w:rPr>
+      </w:r>
+    </w:p>
     <w:p>
       <w:pPr>
         <w:jc w:val="center"/>
@@ -105,7 +166,6 @@
         <w:gridCol w:w="1938"/>
         <w:gridCol w:w="1938"/>
         <w:gridCol w:w="1938"/>
-        <w:gridCol w:w="1938"/>
       </w:tblGrid>
       <w:tr>
         <w:tc>
@@ -159,33 +219,6 @@
                 <w:sz w:val="18"/>
               </w:rPr>
               <w:t>Họ và tên</w:t>
-            </w:r>
-          </w:p>
-        </w:tc>
-        <w:tc>
-          <w:tcPr>
-            <w:tcW w:type="dxa" w:w="1361"/>
-            <w:shd w:val="clear" w:color="auto" w:fill="1A365D"/>
-          </w:tcPr>
-          <w:p>
-            <w:pPr>
-              <w:jc w:val="center"/>
-            </w:pPr>
-            <w:r>
-              <w:rPr>
-                <w:b/>
-                <w:color w:val="FFFFFF"/>
-              </w:rPr>
-            </w:r>
-            <w:r>
-              <w:rPr>
-                <w:rFonts w:ascii="Times New Roman" w:hAnsi="Times New Roman" w:eastAsia="Times New Roman"/>
-                <w:b/>
-                <w:i w:val="0"/>
-                <w:color w:val="FFFFFF"/>
-                <w:sz w:val="18"/>
-              </w:rPr>
-              <w:t>MSSV</w:t>
             </w:r>
           </w:p>
         </w:tc>
@@ -289,27 +322,6 @@
         </w:tc>
         <w:tc>
           <w:tcPr>
-            <w:tcW w:type="dxa" w:w="1361"/>
-          </w:tcPr>
-          <w:p>
-            <w:pPr>
-              <w:jc w:val="center"/>
-            </w:pPr>
-            <w:r/>
-            <w:r>
-              <w:rPr>
-                <w:rFonts w:ascii="Times New Roman" w:hAnsi="Times New Roman" w:eastAsia="Times New Roman"/>
-                <w:b w:val="0"/>
-                <w:i w:val="0"/>
-                <w:color w:val="000000"/>
-                <w:sz w:val="18"/>
-              </w:rPr>
-              <w:t>HE201350</w:t>
-            </w:r>
-          </w:p>
-        </w:tc>
-        <w:tc>
-          <w:tcPr>
             <w:tcW w:type="dxa" w:w="2835"/>
           </w:tcPr>
           <w:p>
@@ -391,27 +403,6 @@
                 <w:sz w:val="18"/>
               </w:rPr>
               <w:t>Đồng Minh Đức</w:t>
-            </w:r>
-          </w:p>
-        </w:tc>
-        <w:tc>
-          <w:tcPr>
-            <w:tcW w:type="dxa" w:w="1361"/>
-          </w:tcPr>
-          <w:p>
-            <w:pPr>
-              <w:jc w:val="center"/>
-            </w:pPr>
-            <w:r/>
-            <w:r>
-              <w:rPr>
-                <w:rFonts w:ascii="Times New Roman" w:hAnsi="Times New Roman" w:eastAsia="Times New Roman"/>
-                <w:b w:val="0"/>
-                <w:i w:val="0"/>
-                <w:color w:val="000000"/>
-                <w:sz w:val="18"/>
-              </w:rPr>
-              <w:t>HE201707</w:t>
             </w:r>
           </w:p>
         </w:tc>
@@ -503,27 +494,6 @@
         </w:tc>
         <w:tc>
           <w:tcPr>
-            <w:tcW w:type="dxa" w:w="1361"/>
-          </w:tcPr>
-          <w:p>
-            <w:pPr>
-              <w:jc w:val="center"/>
-            </w:pPr>
-            <w:r/>
-            <w:r>
-              <w:rPr>
-                <w:rFonts w:ascii="Times New Roman" w:hAnsi="Times New Roman" w:eastAsia="Times New Roman"/>
-                <w:b w:val="0"/>
-                <w:i w:val="0"/>
-                <w:color w:val="000000"/>
-                <w:sz w:val="18"/>
-              </w:rPr>
-              <w:t>HE201680</w:t>
-            </w:r>
-          </w:p>
-        </w:tc>
-        <w:tc>
-          <w:tcPr>
             <w:tcW w:type="dxa" w:w="2835"/>
           </w:tcPr>
           <w:p>
@@ -605,27 +575,6 @@
                 <w:sz w:val="18"/>
               </w:rPr>
               <w:t>Trần Lê Sơn</w:t>
-            </w:r>
-          </w:p>
-        </w:tc>
-        <w:tc>
-          <w:tcPr>
-            <w:tcW w:type="dxa" w:w="1361"/>
-          </w:tcPr>
-          <w:p>
-            <w:pPr>
-              <w:jc w:val="center"/>
-            </w:pPr>
-            <w:r/>
-            <w:r>
-              <w:rPr>
-                <w:rFonts w:ascii="Times New Roman" w:hAnsi="Times New Roman" w:eastAsia="Times New Roman"/>
-                <w:b w:val="0"/>
-                <w:i w:val="0"/>
-                <w:color w:val="000000"/>
-                <w:sz w:val="18"/>
-              </w:rPr>
-              <w:t>HE200407</w:t>
             </w:r>
           </w:p>
         </w:tc>
@@ -1936,7 +1885,7 @@
           <w:color w:val="1A365D"/>
           <w:sz w:val="24"/>
         </w:rPr>
-        <w:t>3.1. Đỗ Manh Chung - HE201350 (~22%)</w:t>
+        <w:t>3.1. Đỗ Manh Chung (~22%)</w:t>
       </w:r>
     </w:p>
     <w:p>
@@ -2053,7 +2002,7 @@
           <w:color w:val="1A365D"/>
           <w:sz w:val="24"/>
         </w:rPr>
-        <w:t>3.2. Đồng Minh Đức - HE201707 (~22%)</w:t>
+        <w:t>3.2. Đồng Minh Đức (~22%)</w:t>
       </w:r>
     </w:p>
     <w:p>
@@ -2170,7 +2119,7 @@
           <w:color w:val="1A365D"/>
           <w:sz w:val="24"/>
         </w:rPr>
-        <w:t>3.3. Phạm Hoàng Hải - HE201680 (~34%) - đóng góp nổi bật</w:t>
+        <w:t>3.3. Phạm Hoàng Hải (~34%) - đóng góp nổi bật</w:t>
       </w:r>
     </w:p>
     <w:p>
@@ -2321,7 +2270,7 @@
           <w:color w:val="1A365D"/>
           <w:sz w:val="24"/>
         </w:rPr>
-        <w:t>3.4. Trần Lê Sơn - HE200407 (~22%)</w:t>
+        <w:t>3.4. Trần Lê Sơn (~22%)</w:t>
       </w:r>
     </w:p>
     <w:p>
@@ -3188,9 +3137,6 @@
               </w:rPr>
               <w:t>Đỗ Manh Chung</w:t>
               <w:br/>
-              <w:t>HE201350</w:t>
-              <w:br/>
-              <w:br/>
               <w:br/>
               <w:t>....................</w:t>
             </w:r>
@@ -3214,9 +3160,6 @@
                 <w:sz w:val="20"/>
               </w:rPr>
               <w:t>Đồng Minh Đức</w:t>
-              <w:br/>
-              <w:t>HE201707</w:t>
-              <w:br/>
               <w:br/>
               <w:br/>
               <w:t>....................</w:t>
@@ -3242,9 +3185,6 @@
               </w:rPr>
               <w:t>Phạm Hoàng Hải</w:t>
               <w:br/>
-              <w:t>HE201680</w:t>
-              <w:br/>
-              <w:br/>
               <w:br/>
               <w:t>....................</w:t>
             </w:r>
@@ -3268,9 +3208,6 @@
                 <w:sz w:val="20"/>
               </w:rPr>
               <w:t>Trần Lê Sơn</w:t>
-              <w:br/>
-              <w:t>HE200407</w:t>
-              <w:br/>
               <w:br/>
               <w:br/>
               <w:t>....................</w:t>

</xml_diff>